<commit_message>
Add tools and AI-assistance disclosure to report title page; correct supporting-files list
</commit_message>
<xml_diff>
--- a/docs/HR_Attrition_Consulting_Report.docx
+++ b/docs/HR_Attrition_Consulting_Report.docx
@@ -419,7 +419,7 @@
                 <w:sz w:val="19"/>
                 <w:szCs w:val="19"/>
               </w:rPr>
-              <w:t xml:space="preserve">HR_Attrition_Analysis.xlsx  ·  hr_attrition_analysis.sql  ·  PowerBI_Build_Guide.md</w:t>
+              <w:t xml:space="preserve">HR_Attrition_Analysis.xlsx  ·  hr_attrition_analysis.sql  ·  HR_Attrition_Dashboard.pbix  ·  FINDINGS.md</w:t>
             </w:r>
           </w:p>
         </w:tc>
@@ -477,6 +477,61 @@
                 <w:szCs w:val="19"/>
               </w:rPr>
               <w:t xml:space="preserve">Internal — contains data-quality findings for the HR data owner</w:t>
+            </w:r>
+          </w:p>
+        </w:tc>
+      </w:tr>
+      <w:tr>
+        <w:tc>
+          <w:tcPr>
+            <w:tcW w:type="dxa" w:w="2600"/>
+            <w:tcMar>
+              <w:top w:type="dxa" w:w="60"/>
+              <w:left w:type="dxa" w:w="100"/>
+              <w:bottom w:type="dxa" w:w="60"/>
+              <w:right w:type="dxa" w:w="100"/>
+            </w:tcMar>
+          </w:tcPr>
+          <w:p>
+            <w:pPr>
+              <w:spacing w:after="0" w:line="250"/>
+            </w:pPr>
+            <w:r>
+              <w:rPr>
+                <w:rFonts w:ascii="Calibri" w:cs="Calibri" w:eastAsia="Calibri" w:hAnsi="Calibri"/>
+                <w:b/>
+                <w:bCs/>
+                <w:sz w:val="19"/>
+                <w:szCs w:val="19"/>
+              </w:rPr>
+              <w:t xml:space="preserve">Tools and method</w:t>
+            </w:r>
+          </w:p>
+        </w:tc>
+        <w:tc>
+          <w:tcPr>
+            <w:tcW w:type="dxa" w:w="6760"/>
+            <w:tcMar>
+              <w:top w:type="dxa" w:w="60"/>
+              <w:left w:type="dxa" w:w="100"/>
+              <w:bottom w:type="dxa" w:w="60"/>
+              <w:right w:type="dxa" w:w="100"/>
+            </w:tcMar>
+          </w:tcPr>
+          <w:p>
+            <w:pPr>
+              <w:spacing w:after="0" w:line="250"/>
+              <w:jc w:val="center"/>
+            </w:pPr>
+            <w:r>
+              <w:rPr>
+                <w:rFonts w:ascii="Calibri" w:cs="Calibri" w:eastAsia="Calibri" w:hAnsi="Calibri"/>
+                <w:b w:val="false"/>
+                <w:bCs w:val="false"/>
+                <w:sz w:val="19"/>
+                <w:szCs w:val="19"/>
+              </w:rPr>
+              <w:t xml:space="preserve">SQL, Excel, Power BI, Python (pandas, statsmodels). Independent analysis with iterative refinement, using AI assistance for coding support and documentation review. Business framing, analytical decisions, interpretation and conclusions are the work of the named analyst.</w:t>
             </w:r>
           </w:p>
         </w:tc>
@@ -20171,7 +20226,7 @@
           <w:sz w:val="18"/>
           <w:szCs w:val="18"/>
         </w:rPr>
-        <w:t xml:space="preserve">Supporting deliverables: HR_Attrition_Analysis.xlsx (data profile, dictionary, cleaning log, KPIs, analysis and risk segmentation, all formula-driven) · hr_attrition_analysis.sql (reproducible profiling, cleaning and analysis) · PowerBI_Build_Guide.md (data model, DAX measures and dashboard specification).</w:t>
+        <w:t xml:space="preserve">Supporting deliverables: HR_Attrition_Analysis.xlsx (data profile, dictionary, cleaning log, KPIs, analysis and risk segmentation, all formula-driven) · hr_attrition_analysis.sql (reproducible profiling, cleaning and analysis) · HR_Attrition_Dashboard.pbix (four-page Power BI report with DAX measures and cross-page filtering).</w:t>
       </w:r>
     </w:p>
     <w:sectPr>

</xml_diff>